<commit_message>
Docx writer: include default style even if paragraph has non-style props.
Previously a paragraph that was, e.g. center-aligned would be
missing its default Body Text style.

Also ensure that any block sequence (list items, table cells,
block quote, div), First Paragraph is set for the first paragraph
in the item.

Closes #11867.

further tweaks
</commit_message>
<xml_diff>
--- a/test/docx/golden/lists.docx
+++ b/test/docx/golden/lists.docx
@@ -13,6 +13,7 @@
     </w:p>
     <w:p>
       <w:pPr>
+        <w:pStyle w:val="FirstParagraph"/>
         <w:numPr>
           <w:ilvl w:val="0"/>
           <w:numId w:val="1001"/>
@@ -24,6 +25,7 @@
     </w:p>
     <w:p>
       <w:pPr>
+        <w:pStyle w:val="FirstParagraph"/>
         <w:numPr>
           <w:ilvl w:val="0"/>
           <w:numId w:val="1001"/>
@@ -35,6 +37,7 @@
     </w:p>
     <w:p>
       <w:pPr>
+        <w:pStyle w:val="FirstParagraph"/>
         <w:numPr>
           <w:ilvl w:val="1"/>
           <w:numId w:val="1002"/>
@@ -46,6 +49,7 @@
     </w:p>
     <w:p>
       <w:pPr>
+        <w:pStyle w:val="FirstParagraph"/>
         <w:numPr>
           <w:ilvl w:val="1"/>
           <w:numId w:val="1002"/>
@@ -57,6 +61,7 @@
     </w:p>
     <w:p>
       <w:pPr>
+        <w:pStyle w:val="FirstParagraph"/>
         <w:numPr>
           <w:ilvl w:val="0"/>
           <w:numId w:val="1003"/>
@@ -68,6 +73,7 @@
     </w:p>
     <w:p>
       <w:pPr>
+        <w:pStyle w:val="FirstParagraph"/>
         <w:numPr>
           <w:ilvl w:val="0"/>
           <w:numId w:val="1003"/>
@@ -79,6 +85,7 @@
     </w:p>
     <w:p>
       <w:pPr>
+        <w:pStyle w:val="FirstParagraph"/>
         <w:numPr>
           <w:ilvl w:val="1"/>
           <w:numId w:val="1004"/>
@@ -90,6 +97,7 @@
     </w:p>
     <w:p>
       <w:pPr>
+        <w:pStyle w:val="FirstParagraph"/>
         <w:numPr>
           <w:ilvl w:val="2"/>
           <w:numId w:val="1005"/>
@@ -101,6 +109,7 @@
     </w:p>
     <w:p>
       <w:pPr>
+        <w:pStyle w:val="BodyText"/>
         <w:numPr>
           <w:ilvl w:val="2"/>
           <w:numId w:val="1000"/>
@@ -112,6 +121,7 @@
     </w:p>
     <w:p>
       <w:pPr>
+        <w:pStyle w:val="FirstParagraph"/>
         <w:numPr>
           <w:ilvl w:val="0"/>
           <w:numId w:val="1003"/>

</xml_diff>